<commit_message>
Fix undertaking header and footer fit
</commit_message>
<xml_diff>
--- a/backend/templates/GSSG-HR_301-003_Leave_Application_Form.docx
+++ b/backend/templates/GSSG-HR_301-003_Leave_Application_Form.docx
@@ -359,7 +359,7 @@
       <w:footerReference w:type="default" r:id="rId14"/>
       <w:headerReference w:type="first" r:id="rId13"/>
       <w:footerReference w:type="first" r:id="rId12"/>
-      <w:pgSz w:w="11900" w:h="16820"/>
+      <w:pgSz w:w="11906" w:h="16838"/>
       <w:pgMar w:top="900" w:right="746" w:bottom="1440" w:left="810" w:header="360" w:footer="84" w:gutter="0"/>
       <w:cols w:space="720"/>
       <w:titlePg/>
@@ -3751,15 +3751,16 @@
   <w:style w:type="paragraph" w:default="1" w:styleId="Normal">
     <w:name w:val="Normal"/>
     <w:qFormat/>
+    <w:rsid w:val="00A37CB4"/>
     <w:pPr>
-      <w:spacing w:after="0" w:line="259" w:lineRule="auto"/>
-      <w:ind w:left="10" w:right="417" w:hanging="10"/>
-      <w:jc w:val="both"/>
+      <w:spacing w:after="0" w:line="240" w:lineRule="auto"/>
     </w:pPr>
     <w:rPr>
-      <w:rFonts w:ascii="Calibri" w:eastAsia="Calibri" w:hAnsi="Calibri" w:cs="Calibri"/>
-      <w:color w:val="000000"/>
-      <w:sz w:val="36"/>
+      <w:kern w:val="0"/>
+      <w:sz w:val="24"/>
+      <w:szCs w:val="24"/>
+      <w:lang w:val="en-GB"/>
+      <w14:ligatures w14:val="none"/>
     </w:rPr>
   </w:style>
   <w:style w:type="character" w:default="1" w:styleId="DefaultParagraphFont">
@@ -3822,14 +3823,22 @@
     <w:link w:val="FooterChar"/>
     <w:uiPriority w:val="99"/>
     <w:unhideWhenUsed/>
-    <w:rsid w:val="00CA41AA"/>
+    <w:rsid w:val="00DE5DC2"/>
     <w:pPr>
       <w:tabs>
         <w:tab w:val="center" w:pos="4513"/>
         <w:tab w:val="right" w:pos="9026"/>
       </w:tabs>
-      <w:spacing w:line="240" w:lineRule="auto"/>
+      <w:ind w:left="0" w:right="0"/>
+      <w:jc w:val="left"/>
     </w:pPr>
+    <w:rPr>
+      <w:kern w:val="2"/>
+      <w:sz w:val="22"/>
+      <w:szCs w:val="22"/>
+      <w:lang w:val="en-AE"/>
+      <w14:ligatures w14:val="standardContextual"/>
+    </w:rPr>
   </w:style>
   <w:style w:type="character" w:customStyle="1" w:styleId="FooterChar">
     <w:name w:val="Footer Char"/>
@@ -3889,9 +3898,12 @@
     <w:qFormat/>
     <w:rsid w:val="00120D4C"/>
     <w:pPr>
+      <w:spacing w:after="0" w:line="240" w:lineRule="auto"/>
       <w:widowControl w:val="0"/>
       <w:autoSpaceDE w:val="0"/>
       <w:autoSpaceDN w:val="0"/>
+      <w:ind w:left="0" w:right="0"/>
+      <w:jc w:val="left"/>
     </w:pPr>
     <w:rPr>
       <w:rFonts w:ascii="Myanmar MN" w:eastAsia="Myanmar MN" w:hAnsi="Myanmar MN" w:cs="Myanmar MN"/>

</xml_diff>

<commit_message>
Match HR footer styles and move Aztec stamps
</commit_message>
<xml_diff>
--- a/backend/templates/GSSG-HR_301-003_Leave_Application_Form.docx
+++ b/backend/templates/GSSG-HR_301-003_Leave_Application_Form.docx
@@ -3356,17 +3356,17 @@
   <w:docDefaults>
     <w:rPrDefault>
       <w:rPr>
-        <w:rFonts w:asciiTheme="minorHAnsi" w:eastAsiaTheme="minorEastAsia" w:hAnsiTheme="minorHAnsi" w:cstheme="minorBidi"/>
+        <w:rFonts w:asciiTheme="minorHAnsi" w:eastAsiaTheme="minorHAnsi" w:hAnsiTheme="minorHAnsi" w:cstheme="minorBidi"/>
         <w:kern w:val="2"/>
-        <w:sz w:val="24"/>
-        <w:szCs w:val="24"/>
-        <w:lang w:val="en-GB" w:eastAsia="en-GB" w:bidi="ar-SA"/>
+        <w:sz w:val="22"/>
+        <w:szCs w:val="22"/>
+        <w:lang w:val="en-AE" w:eastAsia="en-US" w:bidi="ar-SA"/>
         <w14:ligatures w14:val="standardContextual"/>
       </w:rPr>
     </w:rPrDefault>
     <w:pPrDefault>
       <w:pPr>
-        <w:spacing w:after="160" w:line="278" w:lineRule="auto"/>
+        <w:spacing w:after="160" w:line="259" w:lineRule="auto"/>
       </w:pPr>
     </w:pPrDefault>
   </w:docDefaults>
@@ -3829,8 +3829,6 @@
         <w:tab w:val="center" w:pos="4513"/>
         <w:tab w:val="right" w:pos="9026"/>
       </w:tabs>
-      <w:ind w:left="0" w:right="0"/>
-      <w:jc w:val="left"/>
     </w:pPr>
     <w:rPr>
       <w:kern w:val="2"/>
@@ -3898,12 +3896,9 @@
     <w:qFormat/>
     <w:rsid w:val="00120D4C"/>
     <w:pPr>
-      <w:spacing w:after="0" w:line="240" w:lineRule="auto"/>
       <w:widowControl w:val="0"/>
       <w:autoSpaceDE w:val="0"/>
       <w:autoSpaceDN w:val="0"/>
-      <w:ind w:left="0" w:right="0"/>
-      <w:jc w:val="left"/>
     </w:pPr>
     <w:rPr>
       <w:rFonts w:ascii="Myanmar MN" w:eastAsia="Myanmar MN" w:hAnsi="Myanmar MN" w:cs="Myanmar MN"/>

</xml_diff>

<commit_message>
Fix HR document reference and layout issues
</commit_message>
<xml_diff>
--- a/backend/templates/GSSG-HR_301-003_Leave_Application_Form.docx
+++ b/backend/templates/GSSG-HR_301-003_Leave_Application_Form.docx
@@ -4,6 +4,7 @@
   <w:body>
     <w:p>
       <w:pPr>
+        <w:pStyle w:val="LeaveBodyOriginal"/>
         <w:spacing w:after="1041"/>
         <w:ind w:left="0" w:right="0" w:firstLine="0"/>
         <w:jc w:val="center"/>
@@ -51,6 +52,7 @@
           </w:tcPr>
           <w:p>
             <w:pPr>
+              <w:pStyle w:val="LeaveBodyOriginal"/>
               <w:spacing w:after="1041"/>
               <w:ind w:left="0" w:right="0" w:firstLine="0"/>
               <w:jc w:val="left"/>
@@ -78,6 +80,7 @@
           </w:tcPr>
           <w:p>
             <w:pPr>
+              <w:pStyle w:val="LeaveBodyOriginal"/>
               <w:spacing w:after="1041"/>
               <w:ind w:left="0" w:right="0" w:firstLine="0"/>
               <w:jc w:val="left"/>
@@ -113,6 +116,7 @@
           </w:tcPr>
           <w:p>
             <w:pPr>
+              <w:pStyle w:val="LeaveBodyOriginal"/>
               <w:spacing w:after="1041"/>
               <w:ind w:left="0" w:right="0" w:firstLine="0"/>
               <w:jc w:val="left"/>
@@ -146,6 +150,7 @@
           </w:tcPr>
           <w:p>
             <w:pPr>
+              <w:pStyle w:val="LeaveBodyOriginal"/>
               <w:spacing w:after="1041"/>
               <w:ind w:left="0" w:right="0" w:firstLine="0"/>
               <w:jc w:val="left"/>
@@ -179,6 +184,7 @@
           </w:tcPr>
           <w:p>
             <w:pPr>
+              <w:pStyle w:val="LeaveBodyOriginal"/>
               <w:spacing w:after="1041"/>
               <w:ind w:left="0" w:right="0" w:firstLine="0"/>
               <w:jc w:val="left"/>
@@ -210,6 +216,7 @@
     </w:tbl>
     <w:p>
       <w:pPr>
+        <w:pStyle w:val="LeaveBodyOriginal"/>
         <w:spacing w:after="1041"/>
         <w:ind w:left="0" w:right="0" w:firstLine="0"/>
         <w:rPr>
@@ -265,6 +272,7 @@
           </w:tcPr>
           <w:p>
             <w:pPr>
+              <w:pStyle w:val="LeaveBodyOriginal"/>
               <w:ind w:left="0" w:right="5842" w:firstLine="0"/>
             </w:pPr>
             <w:r>
@@ -286,6 +294,7 @@
           </w:tcPr>
           <w:p>
             <w:pPr>
+              <w:pStyle w:val="LeaveBodyOriginal"/>
               <w:ind w:left="0" w:right="5842" w:firstLine="0"/>
             </w:pPr>
             <w:r>
@@ -307,6 +316,7 @@
           </w:tcPr>
           <w:p>
             <w:pPr>
+              <w:pStyle w:val="LeaveBodyOriginal"/>
               <w:ind w:left="0" w:right="5842" w:firstLine="0"/>
             </w:pPr>
             <w:r>
@@ -328,6 +338,7 @@
           </w:tcPr>
           <w:p>
             <w:pPr>
+              <w:pStyle w:val="LeaveBodyOriginal"/>
               <w:ind w:left="0" w:right="5842" w:firstLine="0"/>
             </w:pPr>
             <w:r>
@@ -345,11 +356,13 @@
     </w:tbl>
     <w:p>
       <w:pPr>
+        <w:pStyle w:val="LeaveBodyOriginal"/>
         <w:ind w:left="45" w:right="5842"/>
       </w:pPr>
     </w:p>
     <w:p>
       <w:pPr>
+        <w:pStyle w:val="LeaveBodyOriginal"/>
         <w:ind w:left="45" w:right="5842"/>
       </w:pPr>
     </w:p>
@@ -3763,6 +3776,20 @@
       <w14:ligatures w14:val="none"/>
     </w:rPr>
   </w:style>
+  <w:style w:type="paragraph" w:styleId="LeaveBodyOriginal">
+    <w:name w:val="Leave Body Original"/>
+    <w:qFormat/>
+    <w:pPr>
+      <w:spacing w:after="0" w:line="259" w:lineRule="auto"/>
+      <w:ind w:left="10" w:right="417" w:hanging="10"/>
+      <w:jc w:val="both"/>
+    </w:pPr>
+    <w:rPr>
+      <w:rFonts w:ascii="Calibri" w:eastAsia="Calibri" w:hAnsi="Calibri" w:cs="Calibri"/>
+      <w:color w:val="000000"/>
+      <w:sz w:val="36"/>
+    </w:rPr>
+  </w:style>
   <w:style w:type="character" w:default="1" w:styleId="DefaultParagraphFont">
     <w:name w:val="Default Paragraph Font"/>
     <w:uiPriority w:val="1"/>

</xml_diff>